<commit_message>
Horario oficial: giro 15:30, cierre 19:00, top-5 finalistas y pitch del viernes
Co-Authored-By: Claude Opus 5.5 <noreply@anthropic.com>
</commit_message>
<xml_diff>
--- a/Enunciado_El_Guardian.docx
+++ b/Enunciado_El_Guardian.docx
@@ -1970,7 +1970,7 @@
                 <w:sz w:val="19"/>
                 <w:szCs w:val="19"/>
               </w:rPr>
-              <w:t xml:space="preserve">Día 1, al empezar</w:t>
+              <w:t>Jueves, 10:00</w:t>
             </w:r>
           </w:p>
         </w:tc>
@@ -2107,7 +2107,7 @@
                 <w:sz w:val="19"/>
                 <w:szCs w:val="19"/>
               </w:rPr>
-              <w:t xml:space="preserve">Día 1, a las 14:00</w:t>
+              <w:t>Jueves, 15:30</w:t>
             </w:r>
           </w:p>
         </w:tc>
@@ -4026,7 +4026,7 @@
           <w:b/>
           <w:bCs/>
         </w:rPr>
-        <w:t xml:space="preserve">Después del giro (14:00)</w:t>
+        <w:t>Después del giro (15:30)</w:t>
       </w:r>
       <w:r>
         <w:t xml:space="preserve">, generad un único fichero con los dos conjuntos:</w:t>
@@ -4785,7 +4785,7 @@
                 <w:sz w:val="19"/>
                 <w:szCs w:val="19"/>
               </w:rPr>
-              <w:t xml:space="preserve">Solo los 10 primeros: defensa del método el día 2 (ver apartado 9).</w:t>
+              <w:t>Solo los 5 finalistas: pitch de 5 minutos el viernes (ver apartado 9).</w:t>
             </w:r>
           </w:p>
         </w:tc>
@@ -4915,7 +4915,7 @@
                 <w:sz w:val="19"/>
                 <w:szCs w:val="19"/>
               </w:rPr>
-              <w:t xml:space="preserve">Antes del evento</w:t>
+              <w:t>Jueves · 10:00</w:t>
             </w:r>
           </w:p>
         </w:tc>
@@ -4945,7 +4945,7 @@
                 <w:sz w:val="19"/>
                 <w:szCs w:val="19"/>
               </w:rPr>
-              <w:t xml:space="preserve">Recibís el kit. Podéis empezar a explorar el entrenamiento y el bot de ejemplo.</w:t>
+              <w:t>Presentación técnica del reto. Recibís el material (kit y test) y empezáis a entregar predicciones (hasta 3 entregas antes del giro).</w:t>
             </w:r>
           </w:p>
         </w:tc>
@@ -4977,7 +4977,7 @@
                 <w:sz w:val="19"/>
                 <w:szCs w:val="19"/>
               </w:rPr>
-              <w:t xml:space="preserve">Día 1 · inicio</w:t>
+              <w:t>Jueves · 14:15</w:t>
             </w:r>
           </w:p>
         </w:tc>
@@ -5007,7 +5007,7 @@
                 <w:sz w:val="19"/>
                 <w:szCs w:val="19"/>
               </w:rPr>
-              <w:t xml:space="preserve">Se publica el test. Empezáis a entregar predicciones (</w:t>
+              <w:t>Comida.</w:t>
             </w:r>
             <w:r>
               <w:rPr>
@@ -5016,14 +5016,12 @@
                 <w:sz w:val="19"/>
                 <w:szCs w:val="19"/>
               </w:rPr>
-              <w:t xml:space="preserve">hasta 3 entregas</w:t>
-            </w:r>
-            <w:r>
-              <w:rPr>
-                <w:sz w:val="19"/>
-                <w:szCs w:val="19"/>
-              </w:rPr>
-              <w:t xml:space="preserve"> antes del giro).</w:t>
+            </w:r>
+            <w:r>
+              <w:rPr>
+                <w:sz w:val="19"/>
+                <w:szCs w:val="19"/>
+              </w:rPr>
             </w:r>
           </w:p>
         </w:tc>
@@ -5055,7 +5053,7 @@
                 <w:sz w:val="19"/>
                 <w:szCs w:val="19"/>
               </w:rPr>
-              <w:t xml:space="preserve">Día 1 · 14:00</w:t>
+              <w:t>Jueves · 15:30</w:t>
             </w:r>
           </w:p>
         </w:tc>
@@ -5087,14 +5085,13 @@
                 <w:sz w:val="19"/>
                 <w:szCs w:val="19"/>
               </w:rPr>
-              <w:t xml:space="preserve">El giro</w:t>
-            </w:r>
-            <w:r>
-              <w:rPr>
-                <w:sz w:val="19"/>
-                <w:szCs w:val="19"/>
-              </w:rPr>
-              <w:t xml:space="preserve">: se publica una tanda nueva de casos con un formato distinto. A partir de aquí entregáis test + giro juntos (</w:t>
+              <w:t>El giro: se publica una tanda nueva de casos con un formato distinto. A partir de aquí entregáis test + giro juntos (3 entregas más). Lo que solo funcionaba con el formato del entrenamiento se notará aquí.</w:t>
+            </w:r>
+            <w:r>
+              <w:rPr>
+                <w:sz w:val="19"/>
+                <w:szCs w:val="19"/>
+              </w:rPr>
             </w:r>
             <w:r>
               <w:rPr>
@@ -5103,14 +5100,12 @@
                 <w:sz w:val="19"/>
                 <w:szCs w:val="19"/>
               </w:rPr>
-              <w:t xml:space="preserve">3 entregas más</w:t>
-            </w:r>
-            <w:r>
-              <w:rPr>
-                <w:sz w:val="19"/>
-                <w:szCs w:val="19"/>
-              </w:rPr>
-              <w:t xml:space="preserve">). Lo que solo funcionaba con el formato del entrenamiento se notará aquí.</w:t>
+            </w:r>
+            <w:r>
+              <w:rPr>
+                <w:sz w:val="19"/>
+                <w:szCs w:val="19"/>
+              </w:rPr>
             </w:r>
           </w:p>
         </w:tc>
@@ -5142,7 +5137,7 @@
                 <w:sz w:val="19"/>
                 <w:szCs w:val="19"/>
               </w:rPr>
-              <w:t xml:space="preserve">Día 1 · 18:00</w:t>
+              <w:t>Jueves · 19:00</w:t>
             </w:r>
           </w:p>
         </w:tc>
@@ -5172,7 +5167,7 @@
                 <w:sz w:val="19"/>
                 <w:szCs w:val="19"/>
               </w:rPr>
-              <w:t xml:space="preserve">Cierre de entregas. Se revela la clasificación final con la parte privada.</w:t>
+              <w:t>Cierre de entregas. Se revela la clasificación final con la parte privada.</w:t>
             </w:r>
           </w:p>
         </w:tc>
@@ -5204,7 +5199,7 @@
                 <w:sz w:val="19"/>
                 <w:szCs w:val="19"/>
               </w:rPr>
-              <w:t xml:space="preserve">Día 2</w:t>
+              <w:t>Jueves · 19:00–20:15</w:t>
             </w:r>
           </w:p>
         </w:tc>
@@ -5234,7 +5229,235 @@
                 <w:sz w:val="19"/>
                 <w:szCs w:val="19"/>
               </w:rPr>
-              <w:t xml:space="preserve">Los 10 primeros ejecutan su bot sobre un lote nuevo delante del jurado y defienden su método.</w:t>
+              <w:t>Los 5 primeros ejecutan su bot sobre un lote nuevo delante del jurado.</w:t>
+            </w:r>
+          </w:p>
+        </w:tc>
+      </w:tr>
+      <w:tr>
+        <w:tc>
+          <w:tcPr>
+            <w:tcW w:type="dxa" w:w="2256"/>
+            <w:tcBorders>
+              <w:top w:val="single" w:color="D6DDE5" w:sz="4"/>
+              <w:left w:val="single" w:color="D6DDE5" w:sz="4"/>
+              <w:bottom w:val="single" w:color="D6DDE5" w:sz="4"/>
+              <w:right w:val="single" w:color="D6DDE5" w:sz="4"/>
+            </w:tcBorders>
+            <w:shd w:fill="FFFFFF" w:color="auto" w:val="clear"/>
+            <w:tcMar>
+              <w:top w:type="dxa" w:w="70"/>
+              <w:left w:type="dxa" w:w="110"/>
+              <w:bottom w:type="dxa" w:w="70"/>
+              <w:right w:type="dxa" w:w="110"/>
+            </w:tcMar>
+          </w:tcPr>
+          <w:p>
+            <w:pPr>
+              <w:spacing w:after="20"/>
+            </w:pPr>
+            <w:r>
+              <w:rPr>
+                <w:sz w:val="19"/>
+                <w:szCs w:val="19"/>
+              </w:rPr>
+              <w:t>Jueves · 20:30</w:t>
+            </w:r>
+          </w:p>
+        </w:tc>
+        <w:tc>
+          <w:tcPr>
+            <w:tcW w:type="dxa" w:w="6770"/>
+            <w:tcBorders>
+              <w:top w:val="single" w:color="D6DDE5" w:sz="4"/>
+              <w:left w:val="single" w:color="D6DDE5" w:sz="4"/>
+              <w:bottom w:val="single" w:color="D6DDE5" w:sz="4"/>
+              <w:right w:val="single" w:color="D6DDE5" w:sz="4"/>
+            </w:tcBorders>
+            <w:shd w:fill="FFFFFF" w:color="auto" w:val="clear"/>
+            <w:tcMar>
+              <w:top w:type="dxa" w:w="70"/>
+              <w:left w:type="dxa" w:w="110"/>
+              <w:bottom w:type="dxa" w:w="70"/>
+              <w:right w:type="dxa" w:w="110"/>
+            </w:tcMar>
+          </w:tcPr>
+          <w:p>
+            <w:pPr>
+              <w:spacing w:after="20"/>
+            </w:pPr>
+            <w:r>
+              <w:rPr>
+                <w:sz w:val="19"/>
+                <w:szCs w:val="19"/>
+              </w:rPr>
+              <w:t>Anuncio de los finalistas.</w:t>
+            </w:r>
+            <w:r>
+              <w:rPr>
+                <w:b/>
+                <w:bCs/>
+                <w:sz w:val="19"/>
+                <w:szCs w:val="19"/>
+              </w:rPr>
+            </w:r>
+            <w:r>
+              <w:rPr>
+                <w:sz w:val="19"/>
+                <w:szCs w:val="19"/>
+              </w:rPr>
+            </w:r>
+          </w:p>
+        </w:tc>
+      </w:tr>
+      <w:tr>
+        <w:tc>
+          <w:tcPr>
+            <w:tcW w:type="dxa" w:w="2256"/>
+            <w:tcBorders>
+              <w:top w:val="single" w:color="D6DDE5" w:sz="4"/>
+              <w:left w:val="single" w:color="D6DDE5" w:sz="4"/>
+              <w:bottom w:val="single" w:color="D6DDE5" w:sz="4"/>
+              <w:right w:val="single" w:color="D6DDE5" w:sz="4"/>
+            </w:tcBorders>
+            <w:shd w:fill="FFFFFF" w:color="auto" w:val="clear"/>
+            <w:tcMar>
+              <w:top w:type="dxa" w:w="70"/>
+              <w:left w:type="dxa" w:w="110"/>
+              <w:bottom w:type="dxa" w:w="70"/>
+              <w:right w:type="dxa" w:w="110"/>
+            </w:tcMar>
+          </w:tcPr>
+          <w:p>
+            <w:pPr>
+              <w:spacing w:after="20"/>
+            </w:pPr>
+            <w:r>
+              <w:rPr>
+                <w:sz w:val="19"/>
+                <w:szCs w:val="19"/>
+              </w:rPr>
+              <w:t>Viernes · 9:30</w:t>
+            </w:r>
+          </w:p>
+        </w:tc>
+        <w:tc>
+          <w:tcPr>
+            <w:tcW w:type="dxa" w:w="6770"/>
+            <w:tcBorders>
+              <w:top w:val="single" w:color="D6DDE5" w:sz="4"/>
+              <w:left w:val="single" w:color="D6DDE5" w:sz="4"/>
+              <w:bottom w:val="single" w:color="D6DDE5" w:sz="4"/>
+              <w:right w:val="single" w:color="D6DDE5" w:sz="4"/>
+            </w:tcBorders>
+            <w:shd w:fill="FFFFFF" w:color="auto" w:val="clear"/>
+            <w:tcMar>
+              <w:top w:type="dxa" w:w="70"/>
+              <w:left w:type="dxa" w:w="110"/>
+              <w:bottom w:type="dxa" w:w="70"/>
+              <w:right w:type="dxa" w:w="110"/>
+            </w:tcMar>
+          </w:tcPr>
+          <w:p>
+            <w:pPr>
+              <w:spacing w:after="20"/>
+            </w:pPr>
+            <w:r>
+              <w:rPr>
+                <w:sz w:val="19"/>
+                <w:szCs w:val="19"/>
+              </w:rPr>
+              <w:t>Pitch de los finalistas (5 minutos) ante el jurado, en el Salón de Actos.</w:t>
+            </w:r>
+            <w:r>
+              <w:rPr>
+                <w:b/>
+                <w:bCs/>
+                <w:sz w:val="19"/>
+                <w:szCs w:val="19"/>
+              </w:rPr>
+            </w:r>
+            <w:r>
+              <w:rPr>
+                <w:sz w:val="19"/>
+                <w:szCs w:val="19"/>
+              </w:rPr>
+            </w:r>
+          </w:p>
+        </w:tc>
+      </w:tr>
+      <w:tr>
+        <w:tc>
+          <w:tcPr>
+            <w:tcW w:type="dxa" w:w="2256"/>
+            <w:tcBorders>
+              <w:top w:val="single" w:color="D6DDE5" w:sz="4"/>
+              <w:left w:val="single" w:color="D6DDE5" w:sz="4"/>
+              <w:bottom w:val="single" w:color="D6DDE5" w:sz="4"/>
+              <w:right w:val="single" w:color="D6DDE5" w:sz="4"/>
+            </w:tcBorders>
+            <w:shd w:fill="FFFFFF" w:color="auto" w:val="clear"/>
+            <w:tcMar>
+              <w:top w:type="dxa" w:w="70"/>
+              <w:left w:type="dxa" w:w="110"/>
+              <w:bottom w:type="dxa" w:w="70"/>
+              <w:right w:type="dxa" w:w="110"/>
+            </w:tcMar>
+          </w:tcPr>
+          <w:p>
+            <w:pPr>
+              <w:spacing w:after="20"/>
+            </w:pPr>
+            <w:r>
+              <w:rPr>
+                <w:sz w:val="19"/>
+                <w:szCs w:val="19"/>
+              </w:rPr>
+              <w:t>Viernes · 12:00</w:t>
+            </w:r>
+          </w:p>
+        </w:tc>
+        <w:tc>
+          <w:tcPr>
+            <w:tcW w:type="dxa" w:w="6770"/>
+            <w:tcBorders>
+              <w:top w:val="single" w:color="D6DDE5" w:sz="4"/>
+              <w:left w:val="single" w:color="D6DDE5" w:sz="4"/>
+              <w:bottom w:val="single" w:color="D6DDE5" w:sz="4"/>
+              <w:right w:val="single" w:color="D6DDE5" w:sz="4"/>
+            </w:tcBorders>
+            <w:shd w:fill="FFFFFF" w:color="auto" w:val="clear"/>
+            <w:tcMar>
+              <w:top w:type="dxa" w:w="70"/>
+              <w:left w:type="dxa" w:w="110"/>
+              <w:bottom w:type="dxa" w:w="70"/>
+              <w:right w:type="dxa" w:w="110"/>
+            </w:tcMar>
+          </w:tcPr>
+          <w:p>
+            <w:pPr>
+              <w:spacing w:after="20"/>
+            </w:pPr>
+            <w:r>
+              <w:rPr>
+                <w:sz w:val="19"/>
+                <w:szCs w:val="19"/>
+              </w:rPr>
+              <w:t>Entrega de premios y clausura.</w:t>
+            </w:r>
+            <w:r>
+              <w:rPr>
+                <w:b/>
+                <w:bCs/>
+                <w:sz w:val="19"/>
+                <w:szCs w:val="19"/>
+              </w:rPr>
+            </w:r>
+            <w:r>
+              <w:rPr>
+                <w:sz w:val="19"/>
+                <w:szCs w:val="19"/>
+              </w:rPr>
             </w:r>
           </w:p>
         </w:tc>
@@ -5384,10 +5607,10 @@
           <w:b/>
           <w:bCs/>
         </w:rPr>
-        <w:t xml:space="preserve">Reproducción (día 2):</w:t>
-      </w:r>
-      <w:r>
-        <w:t xml:space="preserve"> los 10 primeros ejecutan su </w:t>
+        <w:t>Reproducción (jueves, de 19:00 a 20:15):</w:t>
+      </w:r>
+      <w:r>
+        <w:t xml:space="preserve"> los 5 primeros ejecutan su </w:t>
       </w:r>
       <w:r>
         <w:rPr>
@@ -5709,7 +5932,7 @@
                 <w:sz w:val="19"/>
                 <w:szCs w:val="19"/>
               </w:rPr>
-              <w:t xml:space="preserve">¿Elegisteis el corte sabiendo que un escape pesa 4 veces más? ¿Aguantó vuestro bot el cambio de las 14:00?</w:t>
+              <w:t>¿Elegisteis el corte sabiendo que un escape pesa 4 veces más? ¿Aguantó vuestro bot el giro de las 15:30?</w:t>
             </w:r>
           </w:p>
         </w:tc>

</xml_diff>

<commit_message>
Datos v2 del reto: train (1.707 casos, 631 H), test (440) y enunciado actualizado
El train no es igual que el test: validad con los casos H (evaluar_local.py --prefijo H).

Co-Authored-By: Claude Opus 5.5 <noreply@anthropic.com>
Claude-Session: https://claude.ai/code/session_01J1gqqb4LWTiQ9VGEohzGxw
</commit_message>
<xml_diff>
--- a/Enunciado_El_Guardian.docx
+++ b/Enunciado_El_Guardian.docx
@@ -1546,7 +1546,7 @@
                 <w:sz w:val="19"/>
                 <w:szCs w:val="19"/>
               </w:rPr>
-              <w:t xml:space="preserve">762 casos de entrenamiento </w:t>
+              <w:t xml:space="preserve">1.707 casos de entrenamiento </w:t>
             </w:r>
             <w:r>
               <w:rPr>
@@ -1803,7 +1803,7 @@
                 <w:sz w:val="19"/>
                 <w:szCs w:val="19"/>
               </w:rPr>
-              <w:t xml:space="preserve">762</w:t>
+              <w:t xml:space="preserve">1.707</w:t>
             </w:r>
           </w:p>
         </w:tc>
@@ -1940,7 +1940,7 @@
                 <w:sz w:val="19"/>
                 <w:szCs w:val="19"/>
               </w:rPr>
-              <w:t xml:space="preserve">155</w:t>
+              <w:t xml:space="preserve">440</w:t>
             </w:r>
           </w:p>
         </w:tc>
@@ -1970,7 +1970,7 @@
                 <w:sz w:val="19"/>
                 <w:szCs w:val="19"/>
               </w:rPr>
-              <w:t>Jueves, 10:00</w:t>
+              <w:t xml:space="preserve">Jueves, 10:00</w:t>
             </w:r>
           </w:p>
         </w:tc>
@@ -2077,7 +2077,7 @@
                 <w:sz w:val="19"/>
                 <w:szCs w:val="19"/>
               </w:rPr>
-              <w:t xml:space="preserve">82</w:t>
+              <w:t xml:space="preserve">220</w:t>
             </w:r>
           </w:p>
         </w:tc>
@@ -2107,7 +2107,7 @@
                 <w:sz w:val="19"/>
                 <w:szCs w:val="19"/>
               </w:rPr>
-              <w:t>Jueves, 15:30</w:t>
+              <w:t xml:space="preserve">Jueves, 15:30</w:t>
             </w:r>
           </w:p>
         </w:tc>
@@ -2153,7 +2153,17 @@
         <w:spacing w:after="120"/>
       </w:pPr>
       <w:r>
-        <w:t xml:space="preserve">Todo está en español. Cada línea de los ficheros es un caso en formato JSON. Los casos del entrenamiento cuyo identificador empieza por </w:t>
+        <w:t xml:space="preserve">Todo está en español. Cada línea de los ficheros es un caso en formato JSON. </w:t>
+      </w:r>
+      <w:r>
+        <w:rPr>
+          <w:b/>
+          <w:bCs/>
+        </w:rPr>
+        <w:t xml:space="preserve">Ojo: el entrenamiento no es igual que el test.</w:t>
+      </w:r>
+      <w:r>
+        <w:t xml:space="preserve"> Los 631 casos cuyo identificador empieza por </w:t>
       </w:r>
       <w:r>
         <w:rPr>
@@ -2161,10 +2171,10 @@
           <w:sz w:val="19"/>
           <w:szCs w:val="19"/>
         </w:rPr>
-        <w:t xml:space="preserve">N</w:t>
-      </w:r>
-      <w:r>
-        <w:t xml:space="preserve"> o por </w:t>
+        <w:t xml:space="preserve">H</w:t>
+      </w:r>
+      <w:r>
+        <w:t xml:space="preserve"> están escritos como el test: muchas fuentes, respuestas que combinan datos y alucinaciones sutiles. El resto es más fácil. Si medís y calibráis con todo el entrenamiento, os vais a confiar: medid sobre todo con los casos </w:t>
       </w:r>
       <w:r>
         <w:rPr>
@@ -2172,10 +2182,10 @@
           <w:sz w:val="19"/>
           <w:szCs w:val="19"/>
         </w:rPr>
-        <w:t xml:space="preserve">s</w:t>
-      </w:r>
-      <w:r>
-        <w:t xml:space="preserve"> son los que más se parecen al test: varias fuentes y respuestas que combinan datos de varias de ellas.</w:t>
+        <w:t xml:space="preserve">H</w:t>
+      </w:r>
+      <w:r>
+        <w:t xml:space="preserve">.</w:t>
       </w:r>
     </w:p>
     <w:p>
@@ -3887,7 +3897,7 @@
         <w:t xml:space="preserve">evaluar_local.py</w:t>
       </w:r>
       <w:r>
-        <w:t xml:space="preserve">. La opción </w:t>
+        <w:t xml:space="preserve">. Con </w:t>
       </w:r>
       <w:r>
         <w:rPr>
@@ -3895,10 +3905,10 @@
           <w:sz w:val="19"/>
           <w:szCs w:val="19"/>
         </w:rPr>
-        <w:t xml:space="preserve">--solo-escenarios</w:t>
-      </w:r>
-      <w:r>
-        <w:t xml:space="preserve"> usa solo los casos que más se parecen al test.</w:t>
+        <w:t xml:space="preserve">--prefijo H</w:t>
+      </w:r>
+      <w:r>
+        <w:t xml:space="preserve"> medís solo sobre los casos que se parecen al test (y no entrenéis sobre los mismos casos con los que medís).</w:t>
       </w:r>
     </w:p>
     <w:p>
@@ -4026,7 +4036,7 @@
           <w:b/>
           <w:bCs/>
         </w:rPr>
-        <w:t>Después del giro (15:30)</w:t>
+        <w:t xml:space="preserve">Después del giro (15:30)</w:t>
       </w:r>
       <w:r>
         <w:t xml:space="preserve">, generad un único fichero con los dos conjuntos:</w:t>
@@ -4335,14 +4345,14 @@
         <w:spacing w:after="120"/>
       </w:pPr>
       <w:r>
-        <w:t xml:space="preserve">El test tiene 68 respuestas fieles. Un bot que deja escapar 5 alucinaciones y da 10 falsas alarmas saca 1 − (4 × 5 + 10) / 68 = 1 − 30 / 68 = </w:t>
+        <w:t xml:space="preserve">El test tiene 265 respuestas fieles. Un bot que deja escapar 20 alucinaciones y da 40 falsas alarmas saca 1 − (4 × 20 + 40) / 265 = 1 − 120 / 265 = </w:t>
       </w:r>
       <w:r>
         <w:rPr>
           <w:b/>
           <w:bCs/>
         </w:rPr>
-        <w:t xml:space="preserve">0,56</w:t>
+        <w:t xml:space="preserve">0,55</w:t>
       </w:r>
       <w:r>
         <w:t xml:space="preserve">.</w:t>
@@ -4417,17 +4427,17 @@
               <w:spacing w:after="60"/>
             </w:pPr>
             <w:r>
-              <w:t xml:space="preserve">El bot de ejemplo saca alrededor de 0 en el test, y fiarse a ciegas del juez LLM da una nota negativa. </w:t>
+              <w:t xml:space="preserve">El bot de ejemplo saca alrededor de −0,25 en el test, y fiarse a ciegas del juez LLM da −0,6: el juez da por buenas muchas alucinaciones sutiles. </w:t>
             </w:r>
             <w:r>
               <w:rPr>
                 <w:b/>
                 <w:bCs/>
               </w:rPr>
-              <w:t xml:space="preserve">Una puntuación de 0,4 en el test ya es un resultado muy bueno.</w:t>
-            </w:r>
-            <w:r>
-              <w:t xml:space="preserve"> No os desaniméis con números bajos al principio: es lo normal.</w:t>
+              <w:t xml:space="preserve">Pasar de 0 ya tiene mérito, y por encima de 0,4 en la nota final es un resultado muy bueno.</w:t>
+            </w:r>
+            <w:r>
+              <w:t xml:space="preserve"> No os desaniméis con números bajos al principio: es lo normal. El reto está pensado para que haya margen de mejora durante todo el día.</w:t>
             </w:r>
           </w:p>
         </w:tc>
@@ -4785,7 +4795,7 @@
                 <w:sz w:val="19"/>
                 <w:szCs w:val="19"/>
               </w:rPr>
-              <w:t>Solo los 5 finalistas: pitch de 5 minutos el viernes (ver apartado 9).</w:t>
+              <w:t xml:space="preserve">Solo los 5 finalistas: pitch del viernes a las 9:30 (ver apartado 9).</w:t>
             </w:r>
           </w:p>
         </w:tc>
@@ -4915,7 +4925,7 @@
                 <w:sz w:val="19"/>
                 <w:szCs w:val="19"/>
               </w:rPr>
-              <w:t>Jueves · 10:00</w:t>
+              <w:t xml:space="preserve">Jueves 15 · 10:00</w:t>
             </w:r>
           </w:p>
         </w:tc>
@@ -4945,7 +4955,23 @@
                 <w:sz w:val="19"/>
                 <w:szCs w:val="19"/>
               </w:rPr>
-              <w:t>Presentación técnica del reto. Recibís el material (kit y test) y empezáis a entregar predicciones (hasta 3 entregas antes del giro).</w:t>
+              <w:t xml:space="preserve">Presentación del reto. Recibís el kit y el test. Empezáis a entregar predicciones (</w:t>
+            </w:r>
+            <w:r>
+              <w:rPr>
+                <w:b/>
+                <w:bCs/>
+                <w:sz w:val="19"/>
+                <w:szCs w:val="19"/>
+              </w:rPr>
+              <w:t xml:space="preserve">hasta 3 entregas</w:t>
+            </w:r>
+            <w:r>
+              <w:rPr>
+                <w:sz w:val="19"/>
+                <w:szCs w:val="19"/>
+              </w:rPr>
+              <w:t xml:space="preserve"> antes del giro).</w:t>
             </w:r>
           </w:p>
         </w:tc>
@@ -4977,7 +5003,7 @@
                 <w:sz w:val="19"/>
                 <w:szCs w:val="19"/>
               </w:rPr>
-              <w:t>Jueves · 14:15</w:t>
+              <w:t xml:space="preserve">Jueves · 14:15</w:t>
             </w:r>
           </w:p>
         </w:tc>
@@ -5007,8 +5033,63 @@
                 <w:sz w:val="19"/>
                 <w:szCs w:val="19"/>
               </w:rPr>
-              <w:t>Comida.</w:t>
-            </w:r>
+              <w:t xml:space="preserve">Comida.</w:t>
+            </w:r>
+          </w:p>
+        </w:tc>
+      </w:tr>
+      <w:tr>
+        <w:tc>
+          <w:tcPr>
+            <w:tcW w:type="dxa" w:w="2256"/>
+            <w:tcBorders>
+              <w:top w:val="single" w:color="D6DDE5" w:sz="4"/>
+              <w:left w:val="single" w:color="D6DDE5" w:sz="4"/>
+              <w:bottom w:val="single" w:color="D6DDE5" w:sz="4"/>
+              <w:right w:val="single" w:color="D6DDE5" w:sz="4"/>
+            </w:tcBorders>
+            <w:shd w:fill="FFFFFF" w:color="auto" w:val="clear"/>
+            <w:tcMar>
+              <w:top w:type="dxa" w:w="70"/>
+              <w:left w:type="dxa" w:w="110"/>
+              <w:bottom w:type="dxa" w:w="70"/>
+              <w:right w:type="dxa" w:w="110"/>
+            </w:tcMar>
+          </w:tcPr>
+          <w:p>
+            <w:pPr>
+              <w:spacing w:after="20"/>
+            </w:pPr>
+            <w:r>
+              <w:rPr>
+                <w:sz w:val="19"/>
+                <w:szCs w:val="19"/>
+              </w:rPr>
+              <w:t xml:space="preserve">Jueves · 15:30</w:t>
+            </w:r>
+          </w:p>
+        </w:tc>
+        <w:tc>
+          <w:tcPr>
+            <w:tcW w:type="dxa" w:w="6770"/>
+            <w:tcBorders>
+              <w:top w:val="single" w:color="D6DDE5" w:sz="4"/>
+              <w:left w:val="single" w:color="D6DDE5" w:sz="4"/>
+              <w:bottom w:val="single" w:color="D6DDE5" w:sz="4"/>
+              <w:right w:val="single" w:color="D6DDE5" w:sz="4"/>
+            </w:tcBorders>
+            <w:shd w:fill="FFFFFF" w:color="auto" w:val="clear"/>
+            <w:tcMar>
+              <w:top w:type="dxa" w:w="70"/>
+              <w:left w:type="dxa" w:w="110"/>
+              <w:bottom w:type="dxa" w:w="70"/>
+              <w:right w:type="dxa" w:w="110"/>
+            </w:tcMar>
+          </w:tcPr>
+          <w:p>
+            <w:pPr>
+              <w:spacing w:after="20"/>
+            </w:pPr>
             <w:r>
               <w:rPr>
                 <w:b/>
@@ -5016,12 +5097,30 @@
                 <w:sz w:val="19"/>
                 <w:szCs w:val="19"/>
               </w:rPr>
-            </w:r>
-            <w:r>
-              <w:rPr>
-                <w:sz w:val="19"/>
-                <w:szCs w:val="19"/>
-              </w:rPr>
+              <w:t xml:space="preserve">El giro</w:t>
+            </w:r>
+            <w:r>
+              <w:rPr>
+                <w:sz w:val="19"/>
+                <w:szCs w:val="19"/>
+              </w:rPr>
+              <w:t xml:space="preserve">: se publica una tanda nueva de casos con un formato distinto. A partir de aquí entregáis test + giro juntos (</w:t>
+            </w:r>
+            <w:r>
+              <w:rPr>
+                <w:b/>
+                <w:bCs/>
+                <w:sz w:val="19"/>
+                <w:szCs w:val="19"/>
+              </w:rPr>
+              <w:t xml:space="preserve">3 entregas más</w:t>
+            </w:r>
+            <w:r>
+              <w:rPr>
+                <w:sz w:val="19"/>
+                <w:szCs w:val="19"/>
+              </w:rPr>
+              <w:t xml:space="preserve">). Lo que solo funcionaba con el formato del entrenamiento se notará aquí.</w:t>
             </w:r>
           </w:p>
         </w:tc>
@@ -5053,7 +5152,7 @@
                 <w:sz w:val="19"/>
                 <w:szCs w:val="19"/>
               </w:rPr>
-              <w:t>Jueves · 15:30</w:t>
+              <w:t xml:space="preserve">Jueves · 19:00</w:t>
             </w:r>
           </w:p>
         </w:tc>
@@ -5080,32 +5179,10 @@
             </w:pPr>
             <w:r>
               <w:rPr>
-                <w:b/>
-                <w:bCs/>
-                <w:sz w:val="19"/>
-                <w:szCs w:val="19"/>
-              </w:rPr>
-              <w:t>El giro: se publica una tanda nueva de casos con un formato distinto. A partir de aquí entregáis test + giro juntos (3 entregas más). Lo que solo funcionaba con el formato del entrenamiento se notará aquí.</w:t>
-            </w:r>
-            <w:r>
-              <w:rPr>
-                <w:sz w:val="19"/>
-                <w:szCs w:val="19"/>
-              </w:rPr>
-            </w:r>
-            <w:r>
-              <w:rPr>
-                <w:b/>
-                <w:bCs/>
-                <w:sz w:val="19"/>
-                <w:szCs w:val="19"/>
-              </w:rPr>
-            </w:r>
-            <w:r>
-              <w:rPr>
-                <w:sz w:val="19"/>
-                <w:szCs w:val="19"/>
-              </w:rPr>
+                <w:sz w:val="19"/>
+                <w:szCs w:val="19"/>
+              </w:rPr>
+              <w:t xml:space="preserve">Cierre de entregas. Se calcula la clasificación final con la parte privada.</w:t>
             </w:r>
           </w:p>
         </w:tc>
@@ -5137,7 +5214,7 @@
                 <w:sz w:val="19"/>
                 <w:szCs w:val="19"/>
               </w:rPr>
-              <w:t>Jueves · 19:00</w:t>
+              <w:t xml:space="preserve">Jueves · 19:00–20:15</w:t>
             </w:r>
           </w:p>
         </w:tc>
@@ -5167,7 +5244,7 @@
                 <w:sz w:val="19"/>
                 <w:szCs w:val="19"/>
               </w:rPr>
-              <w:t>Cierre de entregas. Se revela la clasificación final con la parte privada.</w:t>
+              <w:t xml:space="preserve">Los 5 primeros ejecutan su bot sobre un lote nuevo delante del jurado (reproducción).</w:t>
             </w:r>
           </w:p>
         </w:tc>
@@ -5199,7 +5276,7 @@
                 <w:sz w:val="19"/>
                 <w:szCs w:val="19"/>
               </w:rPr>
-              <w:t>Jueves · 19:00–20:15</w:t>
+              <w:t xml:space="preserve">Jueves · 20:30</w:t>
             </w:r>
           </w:p>
         </w:tc>
@@ -5229,7 +5306,7 @@
                 <w:sz w:val="19"/>
                 <w:szCs w:val="19"/>
               </w:rPr>
-              <w:t>Los 5 primeros ejecutan su bot sobre un lote nuevo delante del jurado.</w:t>
+              <w:t xml:space="preserve">Anuncio de los 5 finalistas.</w:t>
             </w:r>
           </w:p>
         </w:tc>
@@ -5261,7 +5338,7 @@
                 <w:sz w:val="19"/>
                 <w:szCs w:val="19"/>
               </w:rPr>
-              <w:t>Jueves · 20:30</w:t>
+              <w:t xml:space="preserve">Viernes 16 · 9:30</w:t>
             </w:r>
           </w:p>
         </w:tc>
@@ -5291,21 +5368,7 @@
                 <w:sz w:val="19"/>
                 <w:szCs w:val="19"/>
               </w:rPr>
-              <w:t>Anuncio de los finalistas.</w:t>
-            </w:r>
-            <w:r>
-              <w:rPr>
-                <w:b/>
-                <w:bCs/>
-                <w:sz w:val="19"/>
-                <w:szCs w:val="19"/>
-              </w:rPr>
-            </w:r>
-            <w:r>
-              <w:rPr>
-                <w:sz w:val="19"/>
-                <w:szCs w:val="19"/>
-              </w:rPr>
+              <w:t xml:space="preserve">Pitch de los finalistas (5 minutos) ante el jurado, en el Salón de Actos.</w:t>
             </w:r>
           </w:p>
         </w:tc>
@@ -5337,7 +5400,7 @@
                 <w:sz w:val="19"/>
                 <w:szCs w:val="19"/>
               </w:rPr>
-              <w:t>Viernes · 9:30</w:t>
+              <w:t xml:space="preserve">Viernes · 12:00</w:t>
             </w:r>
           </w:p>
         </w:tc>
@@ -5367,97 +5430,7 @@
                 <w:sz w:val="19"/>
                 <w:szCs w:val="19"/>
               </w:rPr>
-              <w:t>Pitch de los finalistas (5 minutos) ante el jurado, en el Salón de Actos.</w:t>
-            </w:r>
-            <w:r>
-              <w:rPr>
-                <w:b/>
-                <w:bCs/>
-                <w:sz w:val="19"/>
-                <w:szCs w:val="19"/>
-              </w:rPr>
-            </w:r>
-            <w:r>
-              <w:rPr>
-                <w:sz w:val="19"/>
-                <w:szCs w:val="19"/>
-              </w:rPr>
-            </w:r>
-          </w:p>
-        </w:tc>
-      </w:tr>
-      <w:tr>
-        <w:tc>
-          <w:tcPr>
-            <w:tcW w:type="dxa" w:w="2256"/>
-            <w:tcBorders>
-              <w:top w:val="single" w:color="D6DDE5" w:sz="4"/>
-              <w:left w:val="single" w:color="D6DDE5" w:sz="4"/>
-              <w:bottom w:val="single" w:color="D6DDE5" w:sz="4"/>
-              <w:right w:val="single" w:color="D6DDE5" w:sz="4"/>
-            </w:tcBorders>
-            <w:shd w:fill="FFFFFF" w:color="auto" w:val="clear"/>
-            <w:tcMar>
-              <w:top w:type="dxa" w:w="70"/>
-              <w:left w:type="dxa" w:w="110"/>
-              <w:bottom w:type="dxa" w:w="70"/>
-              <w:right w:type="dxa" w:w="110"/>
-            </w:tcMar>
-          </w:tcPr>
-          <w:p>
-            <w:pPr>
-              <w:spacing w:after="20"/>
-            </w:pPr>
-            <w:r>
-              <w:rPr>
-                <w:sz w:val="19"/>
-                <w:szCs w:val="19"/>
-              </w:rPr>
-              <w:t>Viernes · 12:00</w:t>
-            </w:r>
-          </w:p>
-        </w:tc>
-        <w:tc>
-          <w:tcPr>
-            <w:tcW w:type="dxa" w:w="6770"/>
-            <w:tcBorders>
-              <w:top w:val="single" w:color="D6DDE5" w:sz="4"/>
-              <w:left w:val="single" w:color="D6DDE5" w:sz="4"/>
-              <w:bottom w:val="single" w:color="D6DDE5" w:sz="4"/>
-              <w:right w:val="single" w:color="D6DDE5" w:sz="4"/>
-            </w:tcBorders>
-            <w:shd w:fill="FFFFFF" w:color="auto" w:val="clear"/>
-            <w:tcMar>
-              <w:top w:type="dxa" w:w="70"/>
-              <w:left w:type="dxa" w:w="110"/>
-              <w:bottom w:type="dxa" w:w="70"/>
-              <w:right w:type="dxa" w:w="110"/>
-            </w:tcMar>
-          </w:tcPr>
-          <w:p>
-            <w:pPr>
-              <w:spacing w:after="20"/>
-            </w:pPr>
-            <w:r>
-              <w:rPr>
-                <w:sz w:val="19"/>
-                <w:szCs w:val="19"/>
-              </w:rPr>
-              <w:t>Entrega de premios y clausura.</w:t>
-            </w:r>
-            <w:r>
-              <w:rPr>
-                <w:b/>
-                <w:bCs/>
-                <w:sz w:val="19"/>
-                <w:szCs w:val="19"/>
-              </w:rPr>
-            </w:r>
-            <w:r>
-              <w:rPr>
-                <w:sz w:val="19"/>
-                <w:szCs w:val="19"/>
-              </w:rPr>
+              <w:t xml:space="preserve">Entrega de premios y clausura.</w:t>
             </w:r>
           </w:p>
         </w:tc>
@@ -5607,7 +5580,7 @@
           <w:b/>
           <w:bCs/>
         </w:rPr>
-        <w:t>Reproducción (jueves, de 19:00 a 20:15):</w:t>
+        <w:t xml:space="preserve">Reproducción (jueves, 19:00–20:15):</w:t>
       </w:r>
       <w:r>
         <w:t xml:space="preserve"> los 5 primeros ejecutan su </w:t>
@@ -5621,7 +5594,7 @@
         <w:t xml:space="preserve">mi_bot.py</w:t>
       </w:r>
       <w:r>
-        <w:t xml:space="preserve"> delante del jurado sobre un lote nuevo que nadie ha visto. Un bot honesto saca una nota parecida. Si cae mucho, o el código no es el que se entregó, la entrega queda descalificada.</w:t>
+        <w:t xml:space="preserve"> delante del jurado sobre un lote nuevo que nadie ha visto. Un bot honesto saca una nota parecida. Si cae mucho, o el código no es el que se entregó, la entrega queda descalificada y entra el siguiente: quedaos hasta el anuncio de las 20:30.</w:t>
       </w:r>
     </w:p>
     <w:p>
@@ -5932,7 +5905,7 @@
                 <w:sz w:val="19"/>
                 <w:szCs w:val="19"/>
               </w:rPr>
-              <w:t>¿Elegisteis el corte sabiendo que un escape pesa 4 veces más? ¿Aguantó vuestro bot el giro de las 15:30?</w:t>
+              <w:t xml:space="preserve">¿Elegisteis el corte sabiendo que un escape pesa 4 veces más? ¿Aguantó vuestro bot el cambio de las 15:30?</w:t>
             </w:r>
           </w:p>
         </w:tc>
@@ -6335,7 +6308,7 @@
         <w:t xml:space="preserve">El juez LLM no es infalible.</w:t>
       </w:r>
       <w:r>
-        <w:t xml:space="preserve"> Pensad cuándo conviene desconfiar de un «respaldada»: poca confianza, el NLI no encuentra respaldo, la frase añade un «gracias a» o un «todos» que no está en la fuente que cita…</w:t>
+        <w:t xml:space="preserve"> Pensad cuándo conviene desconfiar de un «respaldada»: poca confianza, el NLI no encuentra respaldo, la frase añade un «gracias a» o un «todos» que no está en la fuente que cita, la cifra no sale de las cuentas, el verbo es más fuerte que el de la fuente, desaparece un «podría» o un «solo»…</w:t>
       </w:r>
     </w:p>
     <w:p>
@@ -6523,7 +6496,7 @@
         <w:t xml:space="preserve">EJEMPLOS.md</w:t>
       </w:r>
       <w:r>
-        <w:t xml:space="preserve">. Todas las etiquetas las han revisado dos personas por separado.</w:t>
+        <w:t xml:space="preserve">. Todas las etiquetas se han verificado dos veces por separado, y las dudosas se retiraron.</w:t>
       </w:r>
     </w:p>
     <w:sectPr>

</xml_diff>